<commit_message>
RFC-005: estructura multi-repositorio; actualizar Volumen IV
</commit_message>
<xml_diff>
--- a/Biblia/Volumen-IV-Arquitectura-Tecnica.docx
+++ b/Biblia/Volumen-IV-Arquitectura-Tecnica.docx
@@ -432,7 +432,7 @@
           </w:tcPr>
           <w:p>
             <w:r>
-              <w:t xml:space="preserve">RFC-000 · RFC-004 · Hallazgos técnicos de Remotion (2026-07-08)</w:t>
+              <w:t xml:space="preserve">RFC-000 · RFC-004 · RFC-005 · Hallazgos técnicos de Remotion (2026-07-08)</w:t>
             </w:r>
           </w:p>
         </w:tc>
@@ -621,6 +621,22 @@
         <w:t xml:space="preserve">5. Estructura de repositorio</w:t>
       </w:r>
     </w:p>
+    <w:p>
+      <w:pPr>
+        <w:spacing w:after="160"/>
+      </w:pPr>
+      <w:r>
+        <w:t xml:space="preserve">Actualizado por RFC-005 (2026-07-09): Atlas Commerce no vive en un único repositorio, sino en una estructura de un repositorio base más un repositorio por tienda.</w:t>
+      </w:r>
+    </w:p>
+    <w:p>
+      <w:pPr>
+        <w:pStyle w:val="Heading2"/>
+      </w:pPr>
+      <w:r>
+        <w:t xml:space="preserve">5.1 Repositorio base (Atlas-commerce)</w:t>
+      </w:r>
+    </w:p>
     <w:tbl>
       <w:tblPr>
         <w:tblW w:type="dxa" w:w="9360"/>
@@ -828,7 +844,7 @@
           </w:tcPr>
           <w:p>
             <w:r>
-              <w:t xml:space="preserve">Herramientas y proyectos de generación de contenido (video, diseño).</w:t>
+              <w:t xml:space="preserve">Herramientas y proyectos de generación de contenido (video, diseño), compartidos entre tiendas.</w:t>
             </w:r>
           </w:p>
         </w:tc>
@@ -838,6 +854,30 @@
       <w:pPr>
         <w:spacing w:before="200"/>
       </w:pPr>
+    </w:p>
+    <w:p>
+      <w:pPr>
+        <w:pStyle w:val="Heading2"/>
+      </w:pPr>
+      <w:r>
+        <w:t xml:space="preserve">5.2 Repositorios de tienda (atlas-tienda-&lt;slug&gt;)</w:t>
+      </w:r>
+    </w:p>
+    <w:p>
+      <w:pPr>
+        <w:spacing w:after="160"/>
+      </w:pPr>
+      <w:r>
+        <w:t xml:space="preserve">Cada tienda o línea de negocio individual (candidata: productos digitales para mascotas en Etsy) recibe su propio repositorio, aislado de las demás. No copia la Biblia ni los RFCs base: los referencia por cita, conforme al principio de cita de RFC-005. Contiene únicamente productos, contenido y métricas propias de esa tienda.</w:t>
+      </w:r>
+    </w:p>
+    <w:p>
+      <w:pPr>
+        <w:spacing w:after="160"/>
+      </w:pPr>
+      <w:r>
+        <w:t xml:space="preserve">El acceso a estos repositorios se gestiona con tokens en modo "Only select repositories", nunca "All repositories", para que ningún token individual sea un punto único de fallo entre tiendas (Artículo III; ver RFC-005).</w:t>
+      </w:r>
     </w:p>
     <w:p>
       <w:pPr>

</xml_diff>